<commit_message>
docx: regenereret fra plan.json
</commit_message>
<xml_diff>
--- a/data/Fast_as_Fifty_Masterplan_2026.docx
+++ b/data/Fast_as_Fifty_Masterplan_2026.docx
@@ -76,7 +76,7 @@
           <w:color w:val="7A6A58"/>
           <w:sz w:val="20"/>
         </w:rPr>
-        <w:t>Genereret 2026-07-19 fra plan.json</w:t>
+        <w:t>Genereret 2026-07-25 fra plan.json</w:t>
       </w:r>
     </w:p>
     <w:p>
@@ -3750,7 +3750,7 @@
               <w:rPr>
                 <w:sz w:val="20"/>
               </w:rPr>
-              <w:t>Svøm 2500m · 65 min</w:t>
+              <w:t>Hvile</w:t>
             </w:r>
           </w:p>
         </w:tc>
@@ -3764,22 +3764,7 @@
               <w:rPr>
                 <w:sz w:val="20"/>
               </w:rPr>
-              <w:t>- 400m varm-op 10m freeride</w:t>
-              <w:br/>
-              <w:br/>
-              <w:t>5x</w:t>
-              <w:br/>
-              <w:t>- 200m Z3 4m freeride</w:t>
-              <w:br/>
-              <w:t>- 30s pause 1m freeride</w:t>
-              <w:br/>
-              <w:br/>
-              <w:t>- 400m teknik 8m freeride</w:t>
-              <w:br/>
-              <w:t>- 300m cool 5m freeride</w:t>
-              <w:br/>
-              <w:br/>
-              <w:t>Svøm 2500m</w:t>
+              <w:t>Hviledag</w:t>
             </w:r>
           </w:p>
         </w:tc>
@@ -4227,7 +4212,7 @@
               <w:rPr>
                 <w:sz w:val="20"/>
               </w:rPr>
-              <w:t>Hvile</w:t>
+              <w:t>Svøm 2500m (valgfri) · 65 min</w:t>
             </w:r>
           </w:p>
         </w:tc>
@@ -4242,6 +4227,24 @@
                 <w:sz w:val="20"/>
               </w:rPr>
               <w:t>Musik i Gentofte — hvile (fre 31. jul)</w:t>
+              <w:br/>
+              <w:br/>
+              <w:t>- 400m varm-op 10m freeride</w:t>
+              <w:br/>
+              <w:br/>
+              <w:t>5x</w:t>
+              <w:br/>
+              <w:t>- 200m Z3 4m freeride</w:t>
+              <w:br/>
+              <w:t>- 30s pause 1m freeride</w:t>
+              <w:br/>
+              <w:br/>
+              <w:t>- 400m teknik 8m freeride</w:t>
+              <w:br/>
+              <w:t>- 300m cool 5m freeride</w:t>
+              <w:br/>
+              <w:br/>
+              <w:t>Valgfri — kun hvis frisk og overskud. Ellers hviledag (musik i Gentofte om aftenen).</w:t>
             </w:r>
           </w:p>
         </w:tc>

</xml_diff>

<commit_message>
masterplan opdateret (move 7aa7f0e8)
</commit_message>
<xml_diff>
--- a/data/Fast_as_Fifty_Masterplan_2026.docx
+++ b/data/Fast_as_Fifty_Masterplan_2026.docx
@@ -4033,7 +4033,7 @@
               <w:rPr>
                 <w:sz w:val="20"/>
               </w:rPr>
-              <w:t>Svøm 1500m let teknisk · 45 min</w:t>
+              <w:t>FTP-TEST 20 min (opdatér zoner efter) · 65 min</w:t>
             </w:r>
           </w:p>
         </w:tc>
@@ -4047,18 +4047,21 @@
               <w:rPr>
                 <w:sz w:val="20"/>
               </w:rPr>
-              <w:t>- 400m varm-op Z1 8m freeride</w:t>
-              <w:br/>
-              <w:br/>
-              <w:t>5x</w:t>
-              <w:br/>
-              <w:t>- 100m teknik Z1-Z2 2m freeride</w:t>
-              <w:br/>
-              <w:br/>
-              <w:t>- 300m cool 6m freeride</w:t>
-              <w:br/>
-              <w:br/>
-              <w:t>Svøm let 1500m — hviledag for benene mellem løb</w:t>
+              <w:t>- Varm-op progressiv 20m ramp 45-72% FTP</w:t>
+              <w:br/>
+              <w:t>- Åbner 5 min 5m 91-100% FTP</w:t>
+              <w:br/>
+              <w:t>- Let 5m 44-56% FTP</w:t>
+              <w:br/>
+              <w:t>- 20 MIN ALL-OUT TEST — jævn max-indsats 20m freeride</w:t>
+              <w:br/>
+              <w:t>- Cool-down 15m ramp 60-40% FTP</w:t>
+              <w:br/>
+              <w:br/>
+              <w:t>Efter testen: nyt FTP = 95% af 20-min snit-watt — watt ganges direkte, modsat løb hvor pace divideres med 0,95. Eks: 285W snit → 271W FTP. Opdatér i Intervals → Settings. Gentag test hver 3.-4. måned.</w:t>
+              <w:br/>
+              <w:br/>
+              <w:t>FTP-TEST 20 min — morgen (arbejdstung dag)</w:t>
             </w:r>
           </w:p>
         </w:tc>
@@ -4150,7 +4153,7 @@
               <w:rPr>
                 <w:sz w:val="20"/>
               </w:rPr>
-              <w:t>FTP-TEST 20 min (opdatér zoner efter) · 65 min</w:t>
+              <w:t>Svøm 1500m let teknisk · 45 min</w:t>
             </w:r>
           </w:p>
         </w:tc>
@@ -4164,21 +4167,18 @@
               <w:rPr>
                 <w:sz w:val="20"/>
               </w:rPr>
-              <w:t>- Varm-op progressiv 20m ramp 45-72% FTP</w:t>
-              <w:br/>
-              <w:t>- Åbner 5 min 5m 91-100% FTP</w:t>
-              <w:br/>
-              <w:t>- Let 5m 44-56% FTP</w:t>
-              <w:br/>
-              <w:t>- 20 MIN ALL-OUT TEST — jævn max-indsats 20m freeride</w:t>
-              <w:br/>
-              <w:t>- Cool-down 15m ramp 60-40% FTP</w:t>
-              <w:br/>
-              <w:br/>
-              <w:t>Efter testen: nyt FTP = 95% af 20-min snit-watt — watt ganges direkte, modsat løb hvor pace divideres med 0,95. Eks: 285W snit → 271W FTP. Opdatér i Intervals → Settings. Gentag test hver 3.-4. måned.</w:t>
-              <w:br/>
-              <w:br/>
-              <w:t>FTP-TEST 20 min — morgen (arbejdstung dag)</w:t>
+              <w:t>- 400m varm-op Z1 8m freeride</w:t>
+              <w:br/>
+              <w:br/>
+              <w:t>5x</w:t>
+              <w:br/>
+              <w:t>- 100m teknik Z1-Z2 2m freeride</w:t>
+              <w:br/>
+              <w:br/>
+              <w:t>- 300m cool 6m freeride</w:t>
+              <w:br/>
+              <w:br/>
+              <w:t>Svøm let 1500m — hviledag for benene mellem løb</w:t>
             </w:r>
           </w:p>
         </w:tc>

</xml_diff>